<commit_message>
docs(requirements): add finished V1.0 requirements
</commit_message>
<xml_diff>
--- a/Requirements - SABL.docx
+++ b/Requirements - SABL.docx
@@ -49,7 +49,7 @@
         <w:t xml:space="preserve">: July </w:t>
       </w:r>
       <w:r>
-        <w:t>19</w:t>
+        <w:t>21</w:t>
       </w:r>
       <w:r>
         <w:t>, 2026</w:t>
@@ -847,258 +847,471 @@
           <w:b/>
           <w:bCs/>
         </w:rPr>
-        <w:t xml:space="preserve">NFR-1. </w:t>
-      </w:r>
-      <w:r>
-        <w:rPr>
-          <w:rFonts w:ascii="Times New Roman" w:hAnsi="Times New Roman" w:cs="Times New Roman"/>
-        </w:rPr>
-        <w:t xml:space="preserve">Response times must not exceed 100 </w:t>
+        <w:t>NFR-</w:t>
+      </w:r>
+      <w:r>
+        <w:rPr>
+          <w:rFonts w:ascii="Times New Roman" w:hAnsi="Times New Roman" w:cs="Times New Roman"/>
+          <w:b/>
+          <w:bCs/>
+        </w:rPr>
+        <w:t>1</w:t>
+      </w:r>
+      <w:r>
+        <w:rPr>
+          <w:rFonts w:ascii="Times New Roman" w:hAnsi="Times New Roman" w:cs="Times New Roman"/>
+          <w:b/>
+          <w:bCs/>
+        </w:rPr>
+        <w:t xml:space="preserve">. </w:t>
+      </w:r>
+      <w:r>
+        <w:rPr>
+          <w:rFonts w:ascii="Times New Roman" w:hAnsi="Times New Roman" w:cs="Times New Roman"/>
+        </w:rPr>
+        <w:t>The API must enforce HTTPS. Plaintext HTTP requests must be rejected with HTTP 421 (Misdirected Request). The server must only accept connections on port 443 in production; local development uses a self-signed certificate. HSTS (Strict-Transport-Security) must be applied to all responses.</w:t>
+      </w:r>
+    </w:p>
+    <w:p>
+      <w:pPr>
+        <w:rPr>
+          <w:rFonts w:ascii="Times New Roman" w:hAnsi="Times New Roman" w:cs="Times New Roman"/>
+        </w:rPr>
+      </w:pPr>
+      <w:r>
+        <w:rPr>
+          <w:rFonts w:ascii="Times New Roman" w:hAnsi="Times New Roman" w:cs="Times New Roman"/>
+          <w:b/>
+          <w:bCs/>
+        </w:rPr>
+        <w:t>NFR-</w:t>
+      </w:r>
+      <w:r>
+        <w:rPr>
+          <w:rFonts w:ascii="Times New Roman" w:hAnsi="Times New Roman" w:cs="Times New Roman"/>
+          <w:b/>
+          <w:bCs/>
+        </w:rPr>
+        <w:t>2</w:t>
+      </w:r>
+      <w:r>
+        <w:rPr>
+          <w:rFonts w:ascii="Times New Roman" w:hAnsi="Times New Roman" w:cs="Times New Roman"/>
+          <w:b/>
+          <w:bCs/>
+        </w:rPr>
+        <w:t xml:space="preserve">. </w:t>
+      </w:r>
+      <w:r>
+        <w:rPr>
+          <w:rFonts w:ascii="Times New Roman" w:hAnsi="Times New Roman" w:cs="Times New Roman"/>
+        </w:rPr>
+        <w:t>All authentication and authorization events must produce a structured log entry, aligned to the OWASP Logging Cheat Sheet, containing: outcome (success/failure), principal identifier, organization (tenant) context, role, timestamp (ISO 8601), and source IP. Log entries must not include plaintext credentials. Source IP fields must be treated as PII in accordance with applicable data handling policy.</w:t>
+      </w:r>
+    </w:p>
+    <w:p>
+      <w:pPr>
+        <w:rPr>
+          <w:rFonts w:ascii="Times New Roman" w:hAnsi="Times New Roman" w:cs="Times New Roman"/>
+        </w:rPr>
+      </w:pPr>
+      <w:r>
+        <w:rPr>
+          <w:rFonts w:ascii="Times New Roman" w:hAnsi="Times New Roman" w:cs="Times New Roman"/>
+          <w:b/>
+          <w:bCs/>
+        </w:rPr>
+        <w:lastRenderedPageBreak/>
+        <w:t>NFR-</w:t>
+      </w:r>
+      <w:r>
+        <w:rPr>
+          <w:rFonts w:ascii="Times New Roman" w:hAnsi="Times New Roman" w:cs="Times New Roman"/>
+          <w:b/>
+          <w:bCs/>
+        </w:rPr>
+        <w:t>3</w:t>
+      </w:r>
+      <w:r>
+        <w:rPr>
+          <w:rFonts w:ascii="Times New Roman" w:hAnsi="Times New Roman" w:cs="Times New Roman"/>
+          <w:b/>
+          <w:bCs/>
+        </w:rPr>
+        <w:t xml:space="preserve">. </w:t>
+      </w:r>
+      <w:r>
+        <w:rPr>
+          <w:rFonts w:ascii="Times New Roman" w:hAnsi="Times New Roman" w:cs="Times New Roman"/>
+        </w:rPr>
+        <w:t xml:space="preserve">Passwords must be stored as one-way hashes using </w:t>
       </w:r>
       <w:proofErr w:type="spellStart"/>
       <w:r>
         <w:rPr>
           <w:rFonts w:ascii="Times New Roman" w:hAnsi="Times New Roman" w:cs="Times New Roman"/>
         </w:rPr>
-        <w:t>ms</w:t>
+        <w:t>Bcrypt</w:t>
       </w:r>
       <w:proofErr w:type="spellEnd"/>
       <w:r>
         <w:rPr>
           <w:rFonts w:ascii="Times New Roman" w:hAnsi="Times New Roman" w:cs="Times New Roman"/>
         </w:rPr>
-        <w:t xml:space="preserve"> under normal operating conditions.</w:t>
-      </w:r>
-    </w:p>
-    <w:p>
-      <w:pPr>
-        <w:rPr>
-          <w:rFonts w:ascii="Times New Roman" w:hAnsi="Times New Roman" w:cs="Times New Roman"/>
-        </w:rPr>
-      </w:pPr>
-      <w:r>
-        <w:rPr>
-          <w:rFonts w:ascii="Times New Roman" w:hAnsi="Times New Roman" w:cs="Times New Roman"/>
-          <w:b/>
-          <w:bCs/>
-        </w:rPr>
-        <w:t xml:space="preserve">NFR-2. </w:t>
-      </w:r>
-      <w:r>
-        <w:rPr>
-          <w:rFonts w:ascii="Times New Roman" w:hAnsi="Times New Roman" w:cs="Times New Roman"/>
-        </w:rPr>
-        <w:t>The API must enforce HTTPS. Plaintext HTTP requests must be rejected with HTTP 421 (Misdirected Request). The server must only accept connections on port 443 in production; local development uses a self-signed certificate. HSTS (Strict-Transport-Security) must be applied to all responses.</w:t>
-      </w:r>
-    </w:p>
-    <w:p>
-      <w:pPr>
-        <w:rPr>
-          <w:rFonts w:ascii="Times New Roman" w:hAnsi="Times New Roman" w:cs="Times New Roman"/>
-        </w:rPr>
-      </w:pPr>
-      <w:r>
-        <w:rPr>
-          <w:rFonts w:ascii="Times New Roman" w:hAnsi="Times New Roman" w:cs="Times New Roman"/>
-          <w:b/>
-          <w:bCs/>
-        </w:rPr>
-        <w:t xml:space="preserve">NFR-3. </w:t>
-      </w:r>
-      <w:r>
-        <w:rPr>
-          <w:rFonts w:ascii="Times New Roman" w:hAnsi="Times New Roman" w:cs="Times New Roman"/>
-        </w:rPr>
-        <w:t>All authentication and authorization events must produce a structured log entry, aligned to the OWASP Logging Cheat Sheet, containing: outcome (success/failure), principal identifier, organization (tenant) context, role, timestamp (ISO 8601), and source IP. Log entries must not include plaintext credentials. Source IP fields must be treated as PII in accordance with applicable data handling policy.</w:t>
-      </w:r>
-    </w:p>
-    <w:p>
-      <w:pPr>
-        <w:rPr>
-          <w:rFonts w:ascii="Times New Roman" w:hAnsi="Times New Roman" w:cs="Times New Roman"/>
-        </w:rPr>
-      </w:pPr>
-      <w:r>
-        <w:rPr>
-          <w:rFonts w:ascii="Times New Roman" w:hAnsi="Times New Roman" w:cs="Times New Roman"/>
-          <w:b/>
-          <w:bCs/>
+        <w:t xml:space="preserve"> with a minimum work factor of 12. Passwords are never stored in plaintext or using reversible encryption.</w:t>
+      </w:r>
+    </w:p>
+    <w:p>
+      <w:pPr>
+        <w:rPr>
+          <w:rFonts w:ascii="Times New Roman" w:hAnsi="Times New Roman" w:cs="Times New Roman"/>
+        </w:rPr>
+      </w:pPr>
+      <w:r>
+        <w:rPr>
+          <w:rFonts w:ascii="Times New Roman" w:hAnsi="Times New Roman" w:cs="Times New Roman"/>
+          <w:b/>
+          <w:bCs/>
+        </w:rPr>
+        <w:t>NFR-</w:t>
+      </w:r>
+      <w:r>
+        <w:rPr>
+          <w:rFonts w:ascii="Times New Roman" w:hAnsi="Times New Roman" w:cs="Times New Roman"/>
+          <w:b/>
+          <w:bCs/>
+        </w:rPr>
+        <w:t>4</w:t>
+      </w:r>
+      <w:r>
+        <w:rPr>
+          <w:rFonts w:ascii="Times New Roman" w:hAnsi="Times New Roman" w:cs="Times New Roman"/>
+          <w:b/>
+          <w:bCs/>
+        </w:rPr>
+        <w:t xml:space="preserve">. </w:t>
+      </w:r>
+      <w:r>
+        <w:rPr>
+          <w:rFonts w:ascii="Times New Roman" w:hAnsi="Times New Roman" w:cs="Times New Roman"/>
+        </w:rPr>
+        <w:t xml:space="preserve">HTTP responses must conform to RFC 9110 semantics for the applicable method and status code </w:t>
+      </w:r>
+      <w:r>
+        <w:rPr>
+          <w:rFonts w:ascii="Times New Roman" w:hAnsi="Times New Roman" w:cs="Times New Roman"/>
+        </w:rPr>
+        <w:t xml:space="preserve">– </w:t>
+      </w:r>
+      <w:r>
+        <w:rPr>
+          <w:rFonts w:ascii="Times New Roman" w:hAnsi="Times New Roman" w:cs="Times New Roman"/>
+        </w:rPr>
+        <w:t>including required and recommended response headers (e.g., a 201 Created response must include a Location header referencing the created resource's URI).</w:t>
+      </w:r>
+    </w:p>
+    <w:p>
+      <w:pPr>
+        <w:rPr>
+          <w:rFonts w:ascii="Times New Roman" w:hAnsi="Times New Roman" w:cs="Times New Roman"/>
+        </w:rPr>
+      </w:pPr>
+      <w:r>
+        <w:rPr>
+          <w:rFonts w:ascii="Times New Roman" w:hAnsi="Times New Roman" w:cs="Times New Roman"/>
+          <w:b/>
+          <w:bCs/>
+        </w:rPr>
+        <w:t>NFR-</w:t>
+      </w:r>
+      <w:r>
+        <w:rPr>
+          <w:rFonts w:ascii="Times New Roman" w:hAnsi="Times New Roman" w:cs="Times New Roman"/>
+          <w:b/>
+          <w:bCs/>
+        </w:rPr>
+        <w:t>5</w:t>
+      </w:r>
+      <w:r>
+        <w:rPr>
+          <w:rFonts w:ascii="Times New Roman" w:hAnsi="Times New Roman" w:cs="Times New Roman"/>
+          <w:b/>
+          <w:bCs/>
+        </w:rPr>
+        <w:t xml:space="preserve">. </w:t>
+      </w:r>
+      <w:r>
+        <w:rPr>
+          <w:rFonts w:ascii="Times New Roman" w:hAnsi="Times New Roman" w:cs="Times New Roman"/>
+        </w:rPr>
+        <w:t>All error responses must conform to IETF RFC 9457 (Problem Details for HTTP APIs).</w:t>
+      </w:r>
+    </w:p>
+    <w:p>
+      <w:pPr>
+        <w:rPr>
+          <w:rFonts w:ascii="Times New Roman" w:hAnsi="Times New Roman" w:cs="Times New Roman"/>
+        </w:rPr>
+      </w:pPr>
+      <w:r>
+        <w:rPr>
+          <w:rFonts w:ascii="Times New Roman" w:hAnsi="Times New Roman" w:cs="Times New Roman"/>
+          <w:b/>
+          <w:bCs/>
+        </w:rPr>
+        <w:t>NFR-</w:t>
+      </w:r>
+      <w:r>
+        <w:rPr>
+          <w:rFonts w:ascii="Times New Roman" w:hAnsi="Times New Roman" w:cs="Times New Roman"/>
+          <w:b/>
+          <w:bCs/>
+        </w:rPr>
+        <w:t>6</w:t>
+      </w:r>
+      <w:r>
+        <w:rPr>
+          <w:rFonts w:ascii="Times New Roman" w:hAnsi="Times New Roman" w:cs="Times New Roman"/>
+          <w:b/>
+          <w:bCs/>
+        </w:rPr>
+        <w:t xml:space="preserve">. </w:t>
+      </w:r>
+      <w:r>
+        <w:rPr>
+          <w:rFonts w:ascii="Times New Roman" w:hAnsi="Times New Roman" w:cs="Times New Roman"/>
+        </w:rPr>
+        <w:t>All database connections must use a dedicated, least-privilege role. This role must be scoped to only the permissions required for IAM operations. Root or superuser database credentials must never be used by the application.</w:t>
+      </w:r>
+    </w:p>
+    <w:p>
+      <w:pPr>
+        <w:rPr>
+          <w:rFonts w:ascii="Times New Roman" w:hAnsi="Times New Roman" w:cs="Times New Roman"/>
+        </w:rPr>
+      </w:pPr>
+      <w:r>
+        <w:rPr>
+          <w:rFonts w:ascii="Times New Roman" w:hAnsi="Times New Roman" w:cs="Times New Roman"/>
+          <w:b/>
+          <w:bCs/>
+        </w:rPr>
+        <w:t>NFR-</w:t>
+      </w:r>
+      <w:r>
+        <w:rPr>
+          <w:rFonts w:ascii="Times New Roman" w:hAnsi="Times New Roman" w:cs="Times New Roman"/>
+          <w:b/>
+          <w:bCs/>
+        </w:rPr>
+        <w:t>7</w:t>
+      </w:r>
+      <w:r>
+        <w:rPr>
+          <w:rFonts w:ascii="Times New Roman" w:hAnsi="Times New Roman" w:cs="Times New Roman"/>
+          <w:b/>
+          <w:bCs/>
+        </w:rPr>
+        <w:t xml:space="preserve">. </w:t>
+      </w:r>
+      <w:r>
+        <w:rPr>
+          <w:rFonts w:ascii="Times New Roman" w:hAnsi="Times New Roman" w:cs="Times New Roman"/>
+        </w:rPr>
+        <w:t>The API must enforce a rate limit on authentication attempts per source IP. After a configurable threshold of consecutive failed attempts, the source IP must be temporarily blocked and a 429 Too Many Requests response returned.</w:t>
+      </w:r>
+    </w:p>
+    <w:p>
+      <w:pPr>
+        <w:rPr>
+          <w:rFonts w:ascii="Times New Roman" w:hAnsi="Times New Roman" w:cs="Times New Roman"/>
+        </w:rPr>
+      </w:pPr>
+      <w:r>
+        <w:rPr>
+          <w:rFonts w:ascii="Times New Roman" w:hAnsi="Times New Roman" w:cs="Times New Roman"/>
+          <w:b/>
+          <w:bCs/>
+        </w:rPr>
+        <w:t>NFR-</w:t>
+      </w:r>
+      <w:r>
+        <w:rPr>
+          <w:rFonts w:ascii="Times New Roman" w:hAnsi="Times New Roman" w:cs="Times New Roman"/>
+          <w:b/>
+          <w:bCs/>
+        </w:rPr>
+        <w:t>8</w:t>
+      </w:r>
+      <w:r>
+        <w:rPr>
+          <w:rFonts w:ascii="Times New Roman" w:hAnsi="Times New Roman" w:cs="Times New Roman"/>
+          <w:b/>
+          <w:bCs/>
+        </w:rPr>
+        <w:t xml:space="preserve">. </w:t>
+      </w:r>
+      <w:r>
+        <w:rPr>
+          <w:rFonts w:ascii="Times New Roman" w:hAnsi="Times New Roman" w:cs="Times New Roman"/>
+        </w:rPr>
+        <w:t>All data access must be scoped by organization (tenant) identifier at the data access layer. No query may return or modify records across organization boundaries, regardless of the caller's role.</w:t>
+      </w:r>
+    </w:p>
+    <w:p>
+      <w:pPr>
+        <w:rPr>
+          <w:rFonts w:ascii="Times New Roman" w:hAnsi="Times New Roman" w:cs="Times New Roman"/>
+        </w:rPr>
+      </w:pPr>
+      <w:r>
+        <w:rPr>
+          <w:rFonts w:ascii="Times New Roman" w:hAnsi="Times New Roman" w:cs="Times New Roman"/>
+          <w:b/>
+          <w:bCs/>
+        </w:rPr>
+        <w:t>NFR-</w:t>
+      </w:r>
+      <w:r>
+        <w:rPr>
+          <w:rFonts w:ascii="Times New Roman" w:hAnsi="Times New Roman" w:cs="Times New Roman"/>
+          <w:b/>
+          <w:bCs/>
+        </w:rPr>
+        <w:t>9</w:t>
+      </w:r>
+      <w:r>
+        <w:rPr>
+          <w:rFonts w:ascii="Times New Roman" w:hAnsi="Times New Roman" w:cs="Times New Roman"/>
+          <w:b/>
+          <w:bCs/>
+        </w:rPr>
+        <w:t xml:space="preserve">. </w:t>
+      </w:r>
+      <w:r>
+        <w:rPr>
+          <w:rFonts w:ascii="Times New Roman" w:hAnsi="Times New Roman" w:cs="Times New Roman"/>
+        </w:rPr>
+        <w:t xml:space="preserve">The build pipeline must enforce, at minimum: dependency/SCA scanning with the build failing on discovered CVEs of severity 4.0 (CVSS) or higher; static analysis (SAST) via SonarQube with an enforced quality gate; and code coverage reporting via </w:t>
+      </w:r>
+      <w:proofErr w:type="spellStart"/>
+      <w:r>
+        <w:rPr>
+          <w:rFonts w:ascii="Times New Roman" w:hAnsi="Times New Roman" w:cs="Times New Roman"/>
+        </w:rPr>
+        <w:t>JaCoCo</w:t>
+      </w:r>
+      <w:proofErr w:type="spellEnd"/>
+      <w:r>
+        <w:rPr>
+          <w:rFonts w:ascii="Times New Roman" w:hAnsi="Times New Roman" w:cs="Times New Roman"/>
+        </w:rPr>
+        <w:t xml:space="preserve">. Supplemental SAST via </w:t>
+      </w:r>
+      <w:proofErr w:type="spellStart"/>
+      <w:r>
+        <w:rPr>
+          <w:rFonts w:ascii="Times New Roman" w:hAnsi="Times New Roman" w:cs="Times New Roman"/>
+        </w:rPr>
+        <w:t>Semgrep</w:t>
+      </w:r>
+      <w:proofErr w:type="spellEnd"/>
+      <w:r>
+        <w:rPr>
+          <w:rFonts w:ascii="Times New Roman" w:hAnsi="Times New Roman" w:cs="Times New Roman"/>
+        </w:rPr>
+        <w:t xml:space="preserve"> is run outside the build pipeline and is not currently build-gated.</w:t>
+      </w:r>
+    </w:p>
+    <w:p>
+      <w:pPr>
+        <w:rPr>
+          <w:rFonts w:ascii="Times New Roman" w:hAnsi="Times New Roman" w:cs="Times New Roman"/>
+        </w:rPr>
+      </w:pPr>
+    </w:p>
+    <w:p>
+      <w:pPr>
+        <w:rPr>
+          <w:rFonts w:ascii="Times New Roman" w:hAnsi="Times New Roman" w:cs="Times New Roman"/>
+        </w:rPr>
+      </w:pPr>
+    </w:p>
+    <w:p>
+      <w:pPr>
+        <w:rPr>
+          <w:rFonts w:ascii="Times New Roman" w:hAnsi="Times New Roman" w:cs="Times New Roman"/>
+        </w:rPr>
+      </w:pPr>
+    </w:p>
+    <w:p>
+      <w:pPr>
+        <w:rPr>
+          <w:rFonts w:ascii="Times New Roman" w:hAnsi="Times New Roman" w:cs="Times New Roman"/>
+        </w:rPr>
+      </w:pPr>
+    </w:p>
+    <w:p>
+      <w:pPr>
+        <w:rPr>
+          <w:rFonts w:ascii="Times New Roman" w:hAnsi="Times New Roman" w:cs="Times New Roman"/>
+        </w:rPr>
+      </w:pPr>
+    </w:p>
+    <w:p>
+      <w:pPr>
+        <w:rPr>
+          <w:rFonts w:ascii="Times New Roman" w:hAnsi="Times New Roman" w:cs="Times New Roman"/>
+        </w:rPr>
+      </w:pPr>
+    </w:p>
+    <w:p>
+      <w:pPr>
+        <w:rPr>
+          <w:rFonts w:ascii="Times New Roman" w:hAnsi="Times New Roman" w:cs="Times New Roman"/>
+        </w:rPr>
+      </w:pPr>
+    </w:p>
+    <w:p>
+      <w:pPr>
+        <w:rPr>
+          <w:rFonts w:ascii="Times New Roman" w:hAnsi="Times New Roman" w:cs="Times New Roman"/>
+        </w:rPr>
+      </w:pPr>
+    </w:p>
+    <w:p>
+      <w:pPr>
+        <w:rPr>
+          <w:rFonts w:ascii="Times New Roman" w:hAnsi="Times New Roman" w:cs="Times New Roman"/>
+        </w:rPr>
+      </w:pPr>
+    </w:p>
+    <w:p>
+      <w:pPr>
+        <w:rPr>
+          <w:rFonts w:ascii="Times New Roman" w:hAnsi="Times New Roman" w:cs="Times New Roman"/>
+        </w:rPr>
+      </w:pPr>
+    </w:p>
+    <w:p>
+      <w:pPr>
+        <w:rPr>
+          <w:rFonts w:ascii="Times New Roman" w:hAnsi="Times New Roman" w:cs="Times New Roman"/>
+        </w:rPr>
+      </w:pPr>
+    </w:p>
+    <w:p>
+      <w:pPr>
+        <w:pStyle w:val="Heading1"/>
+        <w:rPr>
+          <w:rFonts w:ascii="Times New Roman" w:hAnsi="Times New Roman" w:cs="Times New Roman"/>
+        </w:rPr>
+      </w:pPr>
+      <w:r>
+        <w:rPr>
+          <w:rFonts w:ascii="Times New Roman" w:hAnsi="Times New Roman" w:cs="Times New Roman"/>
         </w:rPr>
         <w:lastRenderedPageBreak/>
-        <w:t xml:space="preserve">NFR-4. </w:t>
-      </w:r>
-      <w:r>
-        <w:rPr>
-          <w:rFonts w:ascii="Times New Roman" w:hAnsi="Times New Roman" w:cs="Times New Roman"/>
-        </w:rPr>
-        <w:t xml:space="preserve">Passwords must be stored as one-way hashes using </w:t>
-      </w:r>
-      <w:proofErr w:type="spellStart"/>
-      <w:r>
-        <w:rPr>
-          <w:rFonts w:ascii="Times New Roman" w:hAnsi="Times New Roman" w:cs="Times New Roman"/>
-        </w:rPr>
-        <w:t>Bcrypt</w:t>
-      </w:r>
-      <w:proofErr w:type="spellEnd"/>
-      <w:r>
-        <w:rPr>
-          <w:rFonts w:ascii="Times New Roman" w:hAnsi="Times New Roman" w:cs="Times New Roman"/>
-        </w:rPr>
-        <w:t xml:space="preserve"> with a minimum work factor of 12. Passwords are never stored in plaintext or using reversible encryption.</w:t>
-      </w:r>
-    </w:p>
-    <w:p>
-      <w:pPr>
-        <w:rPr>
-          <w:rFonts w:ascii="Times New Roman" w:hAnsi="Times New Roman" w:cs="Times New Roman"/>
-        </w:rPr>
-      </w:pPr>
-      <w:r>
-        <w:rPr>
-          <w:rFonts w:ascii="Times New Roman" w:hAnsi="Times New Roman" w:cs="Times New Roman"/>
-          <w:b/>
-          <w:bCs/>
-        </w:rPr>
-        <w:t xml:space="preserve">NFR-5. </w:t>
-      </w:r>
-      <w:r>
-        <w:rPr>
-          <w:rFonts w:ascii="Times New Roman" w:hAnsi="Times New Roman" w:cs="Times New Roman"/>
-        </w:rPr>
-        <w:t>All error responses must conform to IETF RFC 9457 (Problem Details for HTTP APIs).</w:t>
-      </w:r>
-    </w:p>
-    <w:p>
-      <w:pPr>
-        <w:rPr>
-          <w:rFonts w:ascii="Times New Roman" w:hAnsi="Times New Roman" w:cs="Times New Roman"/>
-        </w:rPr>
-      </w:pPr>
-      <w:r>
-        <w:rPr>
-          <w:rFonts w:ascii="Times New Roman" w:hAnsi="Times New Roman" w:cs="Times New Roman"/>
-          <w:b/>
-          <w:bCs/>
-        </w:rPr>
-        <w:t xml:space="preserve">NFR-6. </w:t>
-      </w:r>
-      <w:r>
-        <w:rPr>
-          <w:rFonts w:ascii="Times New Roman" w:hAnsi="Times New Roman" w:cs="Times New Roman"/>
-        </w:rPr>
-        <w:t>All database connections must use a dedicated, least-privilege role. This role must be scoped to only the permissions required for IAM operations. Root or superuser database credentials must never be used by the application.</w:t>
-      </w:r>
-    </w:p>
-    <w:p>
-      <w:pPr>
-        <w:rPr>
-          <w:rFonts w:ascii="Times New Roman" w:hAnsi="Times New Roman" w:cs="Times New Roman"/>
-        </w:rPr>
-      </w:pPr>
-      <w:r>
-        <w:rPr>
-          <w:rFonts w:ascii="Times New Roman" w:hAnsi="Times New Roman" w:cs="Times New Roman"/>
-          <w:b/>
-          <w:bCs/>
-        </w:rPr>
-        <w:t xml:space="preserve">NFR-7. </w:t>
-      </w:r>
-      <w:r>
-        <w:rPr>
-          <w:rFonts w:ascii="Times New Roman" w:hAnsi="Times New Roman" w:cs="Times New Roman"/>
-        </w:rPr>
-        <w:t>The API must enforce a rate limit on authentication attempts per source IP. After a configurable threshold of consecutive failed attempts, the source IP must be temporarily blocked and a 429 Too Many Requests response returned.</w:t>
-      </w:r>
-    </w:p>
-    <w:p>
-      <w:pPr>
-        <w:rPr>
-          <w:rFonts w:ascii="Times New Roman" w:hAnsi="Times New Roman" w:cs="Times New Roman"/>
-        </w:rPr>
-      </w:pPr>
-      <w:r>
-        <w:rPr>
-          <w:rFonts w:ascii="Times New Roman" w:hAnsi="Times New Roman" w:cs="Times New Roman"/>
-          <w:b/>
-          <w:bCs/>
-        </w:rPr>
-        <w:t xml:space="preserve">NFR-8. </w:t>
-      </w:r>
-      <w:r>
-        <w:rPr>
-          <w:rFonts w:ascii="Times New Roman" w:hAnsi="Times New Roman" w:cs="Times New Roman"/>
-        </w:rPr>
-        <w:t>All data access must be scoped by organization (tenant) identifier at the data access layer. No query may return or modify records across organization boundaries, regardless of the caller's role.</w:t>
-      </w:r>
-    </w:p>
-    <w:p>
-      <w:pPr>
-        <w:rPr>
-          <w:rFonts w:ascii="Times New Roman" w:hAnsi="Times New Roman" w:cs="Times New Roman"/>
-        </w:rPr>
-      </w:pPr>
-      <w:r>
-        <w:rPr>
-          <w:rFonts w:ascii="Times New Roman" w:hAnsi="Times New Roman" w:cs="Times New Roman"/>
-          <w:b/>
-          <w:bCs/>
-        </w:rPr>
-        <w:t xml:space="preserve">NFR-9. </w:t>
-      </w:r>
-      <w:r>
-        <w:rPr>
-          <w:rFonts w:ascii="Times New Roman" w:hAnsi="Times New Roman" w:cs="Times New Roman"/>
-        </w:rPr>
-        <w:t xml:space="preserve">The build pipeline must enforce, at minimum: dependency/SCA scanning with the build failing on discovered CVEs of severity 4.0 (CVSS) or higher; static analysis (SAST) via SonarQube with an enforced quality gate; and code coverage reporting via </w:t>
-      </w:r>
-      <w:proofErr w:type="spellStart"/>
-      <w:r>
-        <w:rPr>
-          <w:rFonts w:ascii="Times New Roman" w:hAnsi="Times New Roman" w:cs="Times New Roman"/>
-        </w:rPr>
-        <w:t>JaCoCo</w:t>
-      </w:r>
-      <w:proofErr w:type="spellEnd"/>
-      <w:r>
-        <w:rPr>
-          <w:rFonts w:ascii="Times New Roman" w:hAnsi="Times New Roman" w:cs="Times New Roman"/>
-        </w:rPr>
-        <w:t xml:space="preserve">. Supplemental SAST via </w:t>
-      </w:r>
-      <w:proofErr w:type="spellStart"/>
-      <w:r>
-        <w:rPr>
-          <w:rFonts w:ascii="Times New Roman" w:hAnsi="Times New Roman" w:cs="Times New Roman"/>
-        </w:rPr>
-        <w:t>Semgrep</w:t>
-      </w:r>
-      <w:proofErr w:type="spellEnd"/>
-      <w:r>
-        <w:rPr>
-          <w:rFonts w:ascii="Times New Roman" w:hAnsi="Times New Roman" w:cs="Times New Roman"/>
-        </w:rPr>
-        <w:t xml:space="preserve"> is run outside the build pipeline and is not currently build-gated.</w:t>
-      </w:r>
-    </w:p>
-    <w:p>
-      <w:pPr>
-        <w:rPr>
-          <w:rFonts w:ascii="Times New Roman" w:hAnsi="Times New Roman" w:cs="Times New Roman"/>
-        </w:rPr>
-      </w:pPr>
-    </w:p>
-    <w:p>
-      <w:pPr>
-        <w:pStyle w:val="Heading1"/>
-        <w:rPr>
-          <w:rFonts w:ascii="Times New Roman" w:hAnsi="Times New Roman" w:cs="Times New Roman"/>
-        </w:rPr>
-      </w:pPr>
-      <w:r>
-        <w:rPr>
-          <w:rFonts w:ascii="Times New Roman" w:hAnsi="Times New Roman" w:cs="Times New Roman"/>
-        </w:rPr>
         <w:t>Standards</w:t>
       </w:r>
     </w:p>
@@ -1108,29 +1321,373 @@
           <w:rFonts w:ascii="Times New Roman" w:hAnsi="Times New Roman" w:cs="Times New Roman"/>
         </w:rPr>
       </w:pPr>
+      <w:r>
+        <w:rPr>
+          <w:rFonts w:ascii="Times New Roman" w:hAnsi="Times New Roman" w:cs="Times New Roman"/>
+          <w:b/>
+          <w:bCs/>
+        </w:rPr>
+        <w:t>RFC 6797</w:t>
+      </w:r>
+      <w:r>
+        <w:rPr>
+          <w:rFonts w:ascii="Times New Roman" w:hAnsi="Times New Roman" w:cs="Times New Roman"/>
+        </w:rPr>
+        <w:t xml:space="preserve"> – HTTP Strict Transport Security (HSTS), supports NFR-</w:t>
+      </w:r>
+      <w:r>
+        <w:rPr>
+          <w:rFonts w:ascii="Times New Roman" w:hAnsi="Times New Roman" w:cs="Times New Roman"/>
+        </w:rPr>
+        <w:t>1</w:t>
+      </w:r>
+      <w:r>
+        <w:rPr>
+          <w:rFonts w:ascii="Times New Roman" w:hAnsi="Times New Roman" w:cs="Times New Roman"/>
+        </w:rPr>
+        <w:t xml:space="preserve">: </w:t>
+      </w:r>
       <w:hyperlink r:id="rId6" w:history="1">
         <w:r>
           <w:rPr>
             <w:rStyle w:val="Hyperlink"/>
             <w:rFonts w:ascii="Times New Roman" w:hAnsi="Times New Roman" w:cs="Times New Roman"/>
           </w:rPr>
-          <w:t>RFC 9457: Problem Details for HTTP APIs | RFC Editor</w:t>
+          <w:t>https://www.rfc-editor.org/rfc/rfc6797.html</w:t>
         </w:r>
       </w:hyperlink>
-    </w:p>
-    <w:p>
-      <w:pPr>
-        <w:rPr>
-          <w:rFonts w:ascii="Times New Roman" w:hAnsi="Times New Roman" w:cs="Times New Roman"/>
-        </w:rPr>
-      </w:pPr>
+      <w:r>
+        <w:rPr>
+          <w:rFonts w:ascii="Times New Roman" w:hAnsi="Times New Roman" w:cs="Times New Roman"/>
+        </w:rPr>
+        <w:t xml:space="preserve"> </w:t>
+      </w:r>
+    </w:p>
+    <w:p>
+      <w:pPr>
+        <w:rPr>
+          <w:rFonts w:ascii="Times New Roman" w:hAnsi="Times New Roman" w:cs="Times New Roman"/>
+        </w:rPr>
+      </w:pPr>
+      <w:r>
+        <w:rPr>
+          <w:rFonts w:ascii="Times New Roman" w:hAnsi="Times New Roman" w:cs="Times New Roman"/>
+          <w:b/>
+          <w:bCs/>
+        </w:rPr>
+        <w:t>OWASP Logging Cheat Sheet</w:t>
+      </w:r>
+      <w:r>
+        <w:rPr>
+          <w:rFonts w:ascii="Times New Roman" w:hAnsi="Times New Roman" w:cs="Times New Roman"/>
+        </w:rPr>
+        <w:t>, supports NFR-</w:t>
+      </w:r>
+      <w:r>
+        <w:rPr>
+          <w:rFonts w:ascii="Times New Roman" w:hAnsi="Times New Roman" w:cs="Times New Roman"/>
+        </w:rPr>
+        <w:t>2</w:t>
+      </w:r>
+      <w:r>
+        <w:rPr>
+          <w:rFonts w:ascii="Times New Roman" w:hAnsi="Times New Roman" w:cs="Times New Roman"/>
+        </w:rPr>
+        <w:t xml:space="preserve">: </w:t>
+      </w:r>
       <w:hyperlink r:id="rId7" w:history="1">
         <w:r>
           <w:rPr>
             <w:rStyle w:val="Hyperlink"/>
             <w:rFonts w:ascii="Times New Roman" w:hAnsi="Times New Roman" w:cs="Times New Roman"/>
           </w:rPr>
-          <w:t>RFC 9110: HTTP Semantics | RFC Editor</w:t>
+          <w:t>https://cheatsheetseries.owasp.org/cheatsheets/Logging_Cheat_Sheet.html</w:t>
+        </w:r>
+      </w:hyperlink>
+      <w:r>
+        <w:rPr>
+          <w:rFonts w:ascii="Times New Roman" w:hAnsi="Times New Roman" w:cs="Times New Roman"/>
+        </w:rPr>
+        <w:t xml:space="preserve"> </w:t>
+      </w:r>
+    </w:p>
+    <w:p>
+      <w:pPr>
+        <w:rPr>
+          <w:rFonts w:ascii="Times New Roman" w:hAnsi="Times New Roman" w:cs="Times New Roman"/>
+        </w:rPr>
+      </w:pPr>
+      <w:r>
+        <w:rPr>
+          <w:rFonts w:ascii="Times New Roman" w:hAnsi="Times New Roman" w:cs="Times New Roman"/>
+          <w:b/>
+          <w:bCs/>
+        </w:rPr>
+        <w:t>OWASP Logging Vocabulary Cheat Sheet</w:t>
+      </w:r>
+      <w:r>
+        <w:rPr>
+          <w:rFonts w:ascii="Times New Roman" w:hAnsi="Times New Roman" w:cs="Times New Roman"/>
+        </w:rPr>
+        <w:t>, supports NFR-</w:t>
+      </w:r>
+      <w:r>
+        <w:rPr>
+          <w:rFonts w:ascii="Times New Roman" w:hAnsi="Times New Roman" w:cs="Times New Roman"/>
+        </w:rPr>
+        <w:t>2</w:t>
+      </w:r>
+      <w:r>
+        <w:rPr>
+          <w:rFonts w:ascii="Times New Roman" w:hAnsi="Times New Roman" w:cs="Times New Roman"/>
+        </w:rPr>
+        <w:t xml:space="preserve"> structured event fields: </w:t>
+      </w:r>
+      <w:hyperlink r:id="rId8" w:history="1">
+        <w:r>
+          <w:rPr>
+            <w:rStyle w:val="Hyperlink"/>
+            <w:rFonts w:ascii="Times New Roman" w:hAnsi="Times New Roman" w:cs="Times New Roman"/>
+          </w:rPr>
+          <w:t>https://cheatsheetseries.owasp.org/cheatsheets/Logging_Vocabulary_Cheat_Sheet.html</w:t>
+        </w:r>
+      </w:hyperlink>
+      <w:r>
+        <w:rPr>
+          <w:rFonts w:ascii="Times New Roman" w:hAnsi="Times New Roman" w:cs="Times New Roman"/>
+        </w:rPr>
+        <w:t xml:space="preserve"> </w:t>
+      </w:r>
+    </w:p>
+    <w:p>
+      <w:pPr>
+        <w:rPr>
+          <w:rFonts w:ascii="Times New Roman" w:hAnsi="Times New Roman" w:cs="Times New Roman"/>
+        </w:rPr>
+      </w:pPr>
+      <w:r>
+        <w:rPr>
+          <w:rFonts w:ascii="Times New Roman" w:hAnsi="Times New Roman" w:cs="Times New Roman"/>
+          <w:b/>
+          <w:bCs/>
+        </w:rPr>
+        <w:t>OWASP Password Storage Cheat Sheet</w:t>
+      </w:r>
+      <w:r>
+        <w:rPr>
+          <w:rFonts w:ascii="Times New Roman" w:hAnsi="Times New Roman" w:cs="Times New Roman"/>
+        </w:rPr>
+        <w:t>, supports NFR-</w:t>
+      </w:r>
+      <w:r>
+        <w:rPr>
+          <w:rFonts w:ascii="Times New Roman" w:hAnsi="Times New Roman" w:cs="Times New Roman"/>
+        </w:rPr>
+        <w:t>3</w:t>
+      </w:r>
+      <w:r>
+        <w:rPr>
+          <w:rFonts w:ascii="Times New Roman" w:hAnsi="Times New Roman" w:cs="Times New Roman"/>
+        </w:rPr>
+        <w:t xml:space="preserve"> </w:t>
+      </w:r>
+      <w:proofErr w:type="spellStart"/>
+      <w:r>
+        <w:rPr>
+          <w:rFonts w:ascii="Times New Roman" w:hAnsi="Times New Roman" w:cs="Times New Roman"/>
+        </w:rPr>
+        <w:t>bcrypt</w:t>
+      </w:r>
+      <w:proofErr w:type="spellEnd"/>
+      <w:r>
+        <w:rPr>
+          <w:rFonts w:ascii="Times New Roman" w:hAnsi="Times New Roman" w:cs="Times New Roman"/>
+        </w:rPr>
+        <w:t xml:space="preserve"> rationale: </w:t>
+      </w:r>
+      <w:hyperlink r:id="rId9" w:history="1">
+        <w:r>
+          <w:rPr>
+            <w:rStyle w:val="Hyperlink"/>
+            <w:rFonts w:ascii="Times New Roman" w:hAnsi="Times New Roman" w:cs="Times New Roman"/>
+          </w:rPr>
+          <w:t>https://cheatsheetseries.owasp.org/cheatsheets/Password_Storage_Cheat_Sheet.html</w:t>
+        </w:r>
+      </w:hyperlink>
+      <w:r>
+        <w:rPr>
+          <w:rFonts w:ascii="Times New Roman" w:hAnsi="Times New Roman" w:cs="Times New Roman"/>
+        </w:rPr>
+        <w:t xml:space="preserve"> </w:t>
+      </w:r>
+    </w:p>
+    <w:p>
+      <w:pPr>
+        <w:rPr>
+          <w:rFonts w:ascii="Times New Roman" w:hAnsi="Times New Roman" w:cs="Times New Roman"/>
+        </w:rPr>
+      </w:pPr>
+      <w:r>
+        <w:rPr>
+          <w:rFonts w:ascii="Times New Roman" w:hAnsi="Times New Roman" w:cs="Times New Roman"/>
+          <w:b/>
+          <w:bCs/>
+        </w:rPr>
+        <w:t>RFC 9110</w:t>
+      </w:r>
+      <w:r>
+        <w:rPr>
+          <w:rFonts w:ascii="Times New Roman" w:hAnsi="Times New Roman" w:cs="Times New Roman"/>
+        </w:rPr>
+        <w:t xml:space="preserve"> – HTTP Semantics</w:t>
+      </w:r>
+      <w:r>
+        <w:rPr>
+          <w:rFonts w:ascii="Times New Roman" w:hAnsi="Times New Roman" w:cs="Times New Roman"/>
+        </w:rPr>
+        <w:t>, supports NFR-5</w:t>
+      </w:r>
+      <w:r>
+        <w:rPr>
+          <w:rFonts w:ascii="Times New Roman" w:hAnsi="Times New Roman" w:cs="Times New Roman"/>
+        </w:rPr>
+        <w:t xml:space="preserve">: </w:t>
+      </w:r>
+      <w:hyperlink r:id="rId10" w:history="1">
+        <w:r>
+          <w:rPr>
+            <w:rStyle w:val="Hyperlink"/>
+            <w:rFonts w:ascii="Times New Roman" w:hAnsi="Times New Roman" w:cs="Times New Roman"/>
+          </w:rPr>
+          <w:t>https://www.rfc-editor.org/rfc/rfc9110.html</w:t>
+        </w:r>
+      </w:hyperlink>
+      <w:r>
+        <w:rPr>
+          <w:rFonts w:ascii="Times New Roman" w:hAnsi="Times New Roman" w:cs="Times New Roman"/>
+        </w:rPr>
+        <w:t xml:space="preserve"> </w:t>
+      </w:r>
+    </w:p>
+    <w:p>
+      <w:pPr>
+        <w:rPr>
+          <w:rFonts w:ascii="Times New Roman" w:hAnsi="Times New Roman" w:cs="Times New Roman"/>
+        </w:rPr>
+      </w:pPr>
+      <w:r>
+        <w:rPr>
+          <w:rFonts w:ascii="Times New Roman" w:hAnsi="Times New Roman" w:cs="Times New Roman"/>
+          <w:b/>
+          <w:bCs/>
+        </w:rPr>
+        <w:t>RFC 9457</w:t>
+      </w:r>
+      <w:r>
+        <w:rPr>
+          <w:rFonts w:ascii="Times New Roman" w:hAnsi="Times New Roman" w:cs="Times New Roman"/>
+        </w:rPr>
+        <w:t xml:space="preserve"> </w:t>
+      </w:r>
+      <w:r>
+        <w:rPr>
+          <w:rFonts w:ascii="Times New Roman" w:hAnsi="Times New Roman" w:cs="Times New Roman"/>
+        </w:rPr>
+        <w:t xml:space="preserve">– </w:t>
+      </w:r>
+      <w:r>
+        <w:rPr>
+          <w:rFonts w:ascii="Times New Roman" w:hAnsi="Times New Roman" w:cs="Times New Roman"/>
+        </w:rPr>
+        <w:t>Problem Details for HTTP APIs</w:t>
+      </w:r>
+      <w:r>
+        <w:rPr>
+          <w:rFonts w:ascii="Times New Roman" w:hAnsi="Times New Roman" w:cs="Times New Roman"/>
+        </w:rPr>
+        <w:t>, supports NFR-</w:t>
+      </w:r>
+      <w:r>
+        <w:rPr>
+          <w:rFonts w:ascii="Times New Roman" w:hAnsi="Times New Roman" w:cs="Times New Roman"/>
+        </w:rPr>
+        <w:t>5</w:t>
+      </w:r>
+      <w:r>
+        <w:rPr>
+          <w:rFonts w:ascii="Times New Roman" w:hAnsi="Times New Roman" w:cs="Times New Roman"/>
+        </w:rPr>
+        <w:t xml:space="preserve">: </w:t>
+      </w:r>
+      <w:hyperlink r:id="rId11" w:history="1">
+        <w:r>
+          <w:rPr>
+            <w:rStyle w:val="Hyperlink"/>
+            <w:rFonts w:ascii="Times New Roman" w:hAnsi="Times New Roman" w:cs="Times New Roman"/>
+          </w:rPr>
+          <w:t>https://www.rf</w:t>
+        </w:r>
+        <w:r>
+          <w:rPr>
+            <w:rStyle w:val="Hyperlink"/>
+            <w:rFonts w:ascii="Times New Roman" w:hAnsi="Times New Roman" w:cs="Times New Roman"/>
+          </w:rPr>
+          <w:t>c</w:t>
+        </w:r>
+        <w:r>
+          <w:rPr>
+            <w:rStyle w:val="Hyperlink"/>
+            <w:rFonts w:ascii="Times New Roman" w:hAnsi="Times New Roman" w:cs="Times New Roman"/>
+          </w:rPr>
+          <w:t>-editor.org/rfc/rfc9457.html</w:t>
+        </w:r>
+      </w:hyperlink>
+      <w:r>
+        <w:rPr>
+          <w:rFonts w:ascii="Times New Roman" w:hAnsi="Times New Roman" w:cs="Times New Roman"/>
+        </w:rPr>
+        <w:t xml:space="preserve"> </w:t>
+      </w:r>
+    </w:p>
+    <w:p>
+      <w:pPr>
+        <w:rPr>
+          <w:rFonts w:ascii="Times New Roman" w:hAnsi="Times New Roman" w:cs="Times New Roman"/>
+        </w:rPr>
+      </w:pPr>
+      <w:r>
+        <w:rPr>
+          <w:rFonts w:ascii="Times New Roman" w:hAnsi="Times New Roman" w:cs="Times New Roman"/>
+          <w:b/>
+          <w:bCs/>
+        </w:rPr>
+        <w:t>OWASP Authentication Cheat Sheet</w:t>
+      </w:r>
+      <w:r>
+        <w:rPr>
+          <w:rFonts w:ascii="Times New Roman" w:hAnsi="Times New Roman" w:cs="Times New Roman"/>
+        </w:rPr>
+        <w:t>, supports NFR-</w:t>
+      </w:r>
+      <w:r>
+        <w:rPr>
+          <w:rFonts w:ascii="Times New Roman" w:hAnsi="Times New Roman" w:cs="Times New Roman"/>
+        </w:rPr>
+        <w:t>6</w:t>
+      </w:r>
+      <w:r>
+        <w:rPr>
+          <w:rFonts w:ascii="Times New Roman" w:hAnsi="Times New Roman" w:cs="Times New Roman"/>
+        </w:rPr>
+        <w:t xml:space="preserve"> rate-limiting design: </w:t>
+      </w:r>
+      <w:hyperlink r:id="rId12" w:history="1">
+        <w:r>
+          <w:rPr>
+            <w:rStyle w:val="Hyperlink"/>
+            <w:rFonts w:ascii="Times New Roman" w:hAnsi="Times New Roman" w:cs="Times New Roman"/>
+          </w:rPr>
+          <w:t>https://cheatsheetseries.owasp.org/cheatsheets/Authentication_Cheat_Sheet.html</w:t>
         </w:r>
       </w:hyperlink>
     </w:p>
@@ -2627,7 +3184,6 @@
   <w:style w:type="character" w:default="1" w:styleId="DefaultParagraphFont">
     <w:name w:val="Default Paragraph Font"/>
     <w:uiPriority w:val="1"/>
-    <w:semiHidden/>
     <w:unhideWhenUsed/>
   </w:style>
   <w:style w:type="table" w:default="1" w:styleId="TableNormal">
@@ -3099,6 +3655,30 @@
       <w14:ligatures w14:val="none"/>
     </w:rPr>
   </w:style>
+  <w:style w:type="character" w:styleId="UnresolvedMention">
+    <w:name w:val="Unresolved Mention"/>
+    <w:basedOn w:val="DefaultParagraphFont"/>
+    <w:uiPriority w:val="99"/>
+    <w:semiHidden/>
+    <w:unhideWhenUsed/>
+    <w:rsid w:val="007F320D"/>
+    <w:rPr>
+      <w:color w:val="605E5C"/>
+      <w:shd w:val="clear" w:color="auto" w:fill="E1DFDD"/>
+    </w:rPr>
+  </w:style>
+  <w:style w:type="character" w:styleId="FollowedHyperlink">
+    <w:name w:val="FollowedHyperlink"/>
+    <w:basedOn w:val="DefaultParagraphFont"/>
+    <w:uiPriority w:val="99"/>
+    <w:semiHidden/>
+    <w:unhideWhenUsed/>
+    <w:rsid w:val="007F320D"/>
+    <w:rPr>
+      <w:color w:val="96607D" w:themeColor="followedHyperlink"/>
+      <w:u w:val="single"/>
+    </w:rPr>
+  </w:style>
 </w:styles>
 </file>
 

</xml_diff>